<commit_message>
docs: CLAUDE.md expansion, implementation gaps audit, and wiring instruction artifacts
- CLAUDE.md: wholesale phase 2 roadmap, supplier discovery module spec,
  grace access rules, frontend UI/UX patterns, offline cache rules
- IMPLEMENTATION_GAPS.md: audit of built-but-unwired features awaiting
  final integration (grace access, AWaRe coverage, override audit dashboard,
  email notifications, subscription payment flow)
- APOTEKH_Strategy.docx / Revenue_Funder_Strategy.docx: strategy updates
- PharmaConnect Main/aware-coverage/: AWaRe drug classification wiring
  instructions, schema addition, and migration SQL
- PharmaConnect Main/email/: transactional email backend wiring instructions
- PharmaConnect Main/override-audit-dashboard/: override audit frontend + API
  wiring instructions, schema additions
- PharmaConnect Main/subscription/: subscription payment flow wiring
  instructions and schema additions

Co-Authored-By: Claude Sonnet 4.6 <noreply@anthropic.com>
</commit_message>
<xml_diff>
--- a/PharmaConnect Main/APOTEKH_Strategy.docx
+++ b/PharmaConnect Main/APOTEKH_Strategy.docx
@@ -309,7 +309,7 @@
                 <w:sz w:val="20"/>
                 <w:szCs w:val="20"/>
               </w:rPr>
-              <w:t xml:space="preserve">Full dispensing workflow with Superintendent PIN authorization, controlled substance register, receipt generation, void management, and daily close reconciliation.</w:t>
+              <w:t xml:space="preserve">Full dispensing workflow with dispenser override PIN authorization, controlled substance register, receipt generation, void management, and daily close reconciliation.</w:t>
             </w:r>
           </w:p>
         </w:tc>
@@ -717,7 +717,7 @@
                 <w:sz w:val="20"/>
                 <w:szCs w:val="20"/>
               </w:rPr>
-              <w:t xml:space="preserve">Drug interaction checker (4 severity levels + Superintendent PIN escalation), alternative medicine suggestions and therapeutic equivalence matching, AWaRe antibiotic classification (NEMLIT 2021), contraindication alerts (8 patient-status flags), paediatric dose calculator, NCD hints, AI clinical counselling (Anthropic API — session-only, no patient data stored). Available to all paid tiers — never gated.</w:t>
+              <w:t xml:space="preserve">Drug interaction checker (4 severity levels), alternative medicine suggestions and therapeutic equivalence matching, AWaRe antibiotic classification (NEMLIT 2021), contraindication alerts (8 patient-status flags), paediatric dose calculator, NCD hints, AI clinical counselling (Anthropic API — session-only, no patient data stored). Dispensers are warned before any override and proceed at their own risk; all overrides are logged. Available to all paid tiers — never gated.</w:t>
             </w:r>
           </w:p>
         </w:tc>
@@ -5283,7 +5283,7 @@
           <w:sz w:val="22"/>
           <w:szCs w:val="22"/>
         </w:rPr>
-        <w:t xml:space="preserve">Offline-first dispensing with Superintendent PIN authorization for controlled substances</w:t>
+        <w:t xml:space="preserve">Offline-first dispensing with dispenser override PIN authorization for controlled substances</w:t>
       </w:r>
     </w:p>
     <w:p>
@@ -5302,7 +5302,7 @@
           <w:sz w:val="22"/>
           <w:szCs w:val="22"/>
         </w:rPr>
-        <w:t xml:space="preserve">Drug interaction checker (4 severity levels with Superintendent PIN escalation for MAJOR interactions)</w:t>
+        <w:t xml:space="preserve">Drug interaction checker (4 severity levels — dispenser warned, proceeds at own risk, all overrides logged)</w:t>
       </w:r>
     </w:p>
     <w:p>
@@ -7472,7 +7472,7 @@
           <w:sz w:val="22"/>
           <w:szCs w:val="22"/>
         </w:rPr>
-        <w:t xml:space="preserve">The core design principle: alerts inform and log overrides rather than interrupt workflow. A paying customer’s smooth operations must never be compromised by data architecture needs. When a dispenser overrides an interaction alert, the override is logged with the Superintendent PIN and a reason — the dispensing is not blocked. This is not a safety compromise; it mirrors how a well-trained pharmacist actually works. APOTEKH captures the reality of clinical practice rather than imposing an idealized workflow that practitioners route around.</w:t>
+        <w:t xml:space="preserve">The core design principle: alerts inform and log overrides rather than interrupt workflow. A paying customer’s smooth operations must never be compromised by data architecture needs. When a dispenser overrides an interaction alert, the override is logged with the dispenser override PIN and a reason — the dispensing is not blocked. This is not a safety compromise; it mirrors how a well-trained pharmacist actually works. APOTEKH captures the reality of clinical practice rather than imposing an idealized workflow that practitioners route around.</w:t>
       </w:r>
     </w:p>
     <w:p>

</xml_diff>